<commit_message>
feat: Asignación de proyecto
</commit_message>
<xml_diff>
--- a/ProyectosdeGrado_API/plantillas/DSI-FOA-FR-12PresentaciónPropuestaTG.docx
+++ b/ProyectosdeGrado_API/plantillas/DSI-FOA-FR-12PresentaciónPropuestaTG.docx
@@ -318,8 +318,8 @@
           <w:b/>
         </w:rPr>
       </w:pPr>
-      <w:bookmarkStart w:id="2" w:name="_Hlk77857326"/>
-      <w:bookmarkStart w:id="3" w:name="_Hlk76657859"/>
+      <w:bookmarkStart w:id="2" w:name="_Hlk76657859"/>
+      <w:bookmarkStart w:id="3" w:name="_Hlk77857326"/>
     </w:p>
     <w:tbl>
       <w:tblPr>
@@ -345,6 +345,7 @@
             <w:shd w:val="clear" w:color="auto" w:fill="D0CECE" w:themeFill="background2" w:themeFillShade="E6"/>
             <w:vAlign w:val="center"/>
           </w:tcPr>
+          <w:bookmarkEnd w:id="3"/>
           <w:p>
             <w:pPr>
               <w:jc w:val="center"/>
@@ -352,18 +353,11 @@
                 <w:b/>
               </w:rPr>
             </w:pPr>
-            <w:bookmarkStart w:id="4" w:name="_Hlk77857277"/>
-            <w:r>
-              <w:rPr>
-                <w:b/>
-              </w:rPr>
-              <w:t>Participantes</w:t>
-            </w:r>
-            <w:r>
-              <w:rPr>
-                <w:b/>
-              </w:rPr>
-              <w:t xml:space="preserve"> en el desarrollo del trabajo de grado</w:t>
+            <w:r>
+              <w:rPr>
+                <w:b/>
+              </w:rPr>
+              <w:t>Participantes en el desarrollo del trabajo de grado</w:t>
             </w:r>
           </w:p>
         </w:tc>
@@ -374,7 +368,7 @@
         </w:trPr>
         <w:tc>
           <w:tcPr>
-            <w:tcW w:w="569" w:type="pct"/>
+            <w:tcW w:w="498" w:type="pct"/>
             <w:shd w:val="clear" w:color="auto" w:fill="D0CECE" w:themeFill="background2" w:themeFillShade="E6"/>
             <w:vAlign w:val="center"/>
           </w:tcPr>
@@ -395,7 +389,7 @@
         </w:tc>
         <w:tc>
           <w:tcPr>
-            <w:tcW w:w="641" w:type="pct"/>
+            <w:tcW w:w="887" w:type="pct"/>
             <w:shd w:val="clear" w:color="auto" w:fill="D0CECE" w:themeFill="background2" w:themeFillShade="E6"/>
             <w:vAlign w:val="center"/>
           </w:tcPr>
@@ -410,19 +404,13 @@
               <w:rPr>
                 <w:b/>
               </w:rPr>
-              <w:t>Identificació</w:t>
-            </w:r>
-            <w:r>
-              <w:rPr>
-                <w:b/>
-              </w:rPr>
-              <w:t>n</w:t>
-            </w:r>
-          </w:p>
-        </w:tc>
-        <w:tc>
-          <w:tcPr>
-            <w:tcW w:w="1539" w:type="pct"/>
+              <w:t>Identificación</w:t>
+            </w:r>
+          </w:p>
+        </w:tc>
+        <w:tc>
+          <w:tcPr>
+            <w:tcW w:w="1330" w:type="pct"/>
             <w:shd w:val="clear" w:color="auto" w:fill="D0CECE" w:themeFill="background2" w:themeFillShade="E6"/>
             <w:vAlign w:val="center"/>
           </w:tcPr>
@@ -443,7 +431,7 @@
         </w:tc>
         <w:tc>
           <w:tcPr>
-            <w:tcW w:w="1539" w:type="pct"/>
+            <w:tcW w:w="1399" w:type="pct"/>
             <w:shd w:val="clear" w:color="auto" w:fill="D0CECE" w:themeFill="background2" w:themeFillShade="E6"/>
             <w:vAlign w:val="center"/>
           </w:tcPr>
@@ -464,7 +452,7 @@
         </w:tc>
         <w:tc>
           <w:tcPr>
-            <w:tcW w:w="712" w:type="pct"/>
+            <w:tcW w:w="887" w:type="pct"/>
             <w:shd w:val="clear" w:color="auto" w:fill="D0CECE" w:themeFill="background2" w:themeFillShade="E6"/>
             <w:vAlign w:val="center"/>
           </w:tcPr>
@@ -490,7 +478,7 @@
         </w:trPr>
         <w:tc>
           <w:tcPr>
-            <w:tcW w:w="569" w:type="pct"/>
+            <w:tcW w:w="498" w:type="pct"/>
             <w:vAlign w:val="center"/>
           </w:tcPr>
           <w:p>
@@ -509,7 +497,7 @@
         </w:tc>
         <w:tc>
           <w:tcPr>
-            <w:tcW w:w="641" w:type="pct"/>
+            <w:tcW w:w="887" w:type="pct"/>
             <w:vAlign w:val="center"/>
           </w:tcPr>
           <w:p>
@@ -518,13 +506,7 @@
             </w:r>
             <w:proofErr w:type="spellStart"/>
             <w:r>
-              <w:t>codigo_docen</w:t>
-            </w:r>
-            <w:r>
-              <w:t>t</w:t>
-            </w:r>
-            <w:r>
-              <w:t>e</w:t>
+              <w:t>cedula_asesor</w:t>
             </w:r>
             <w:proofErr w:type="spellEnd"/>
             <w:r>
@@ -534,7 +516,7 @@
         </w:tc>
         <w:tc>
           <w:tcPr>
-            <w:tcW w:w="1539" w:type="pct"/>
+            <w:tcW w:w="1330" w:type="pct"/>
             <w:vAlign w:val="center"/>
           </w:tcPr>
           <w:p>
@@ -543,7 +525,7 @@
             </w:r>
             <w:proofErr w:type="spellStart"/>
             <w:r>
-              <w:t>nombre_docente</w:t>
+              <w:t>nombre_asesor</w:t>
             </w:r>
             <w:proofErr w:type="spellEnd"/>
             <w:r>
@@ -553,7 +535,7 @@
         </w:tc>
         <w:tc>
           <w:tcPr>
-            <w:tcW w:w="1539" w:type="pct"/>
+            <w:tcW w:w="1399" w:type="pct"/>
             <w:vAlign w:val="center"/>
           </w:tcPr>
           <w:p>
@@ -562,7 +544,7 @@
             </w:r>
             <w:proofErr w:type="spellStart"/>
             <w:r>
-              <w:t>correo_docente</w:t>
+              <w:t>correo_asesor</w:t>
             </w:r>
             <w:proofErr w:type="spellEnd"/>
             <w:r>
@@ -572,7 +554,7 @@
         </w:tc>
         <w:tc>
           <w:tcPr>
-            <w:tcW w:w="712" w:type="pct"/>
+            <w:tcW w:w="887" w:type="pct"/>
             <w:vAlign w:val="center"/>
           </w:tcPr>
           <w:p>
@@ -581,7 +563,7 @@
             </w:r>
             <w:proofErr w:type="spellStart"/>
             <w:r>
-              <w:t>celular_docente</w:t>
+              <w:t>celular_asesor</w:t>
             </w:r>
             <w:proofErr w:type="spellEnd"/>
             <w:r>
@@ -596,7 +578,7 @@
         </w:trPr>
         <w:tc>
           <w:tcPr>
-            <w:tcW w:w="569" w:type="pct"/>
+            <w:tcW w:w="498" w:type="pct"/>
             <w:vAlign w:val="center"/>
           </w:tcPr>
           <w:p>
@@ -639,31 +621,79 @@
         </w:tc>
         <w:tc>
           <w:tcPr>
-            <w:tcW w:w="641" w:type="pct"/>
-            <w:vAlign w:val="center"/>
-          </w:tcPr>
-          <w:p/>
-        </w:tc>
-        <w:tc>
-          <w:tcPr>
-            <w:tcW w:w="1539" w:type="pct"/>
-            <w:vAlign w:val="center"/>
-          </w:tcPr>
-          <w:p/>
-        </w:tc>
-        <w:tc>
-          <w:tcPr>
-            <w:tcW w:w="1539" w:type="pct"/>
-            <w:vAlign w:val="center"/>
-          </w:tcPr>
-          <w:p/>
-        </w:tc>
-        <w:tc>
-          <w:tcPr>
-            <w:tcW w:w="712" w:type="pct"/>
-            <w:vAlign w:val="center"/>
-          </w:tcPr>
-          <w:p/>
+            <w:tcW w:w="887" w:type="pct"/>
+            <w:vAlign w:val="center"/>
+          </w:tcPr>
+          <w:p>
+            <w:r>
+              <w:t>{{</w:t>
+            </w:r>
+            <w:proofErr w:type="spellStart"/>
+            <w:r>
+              <w:t>cedula_coasesor</w:t>
+            </w:r>
+            <w:proofErr w:type="spellEnd"/>
+            <w:r>
+              <w:t>}}</w:t>
+            </w:r>
+          </w:p>
+        </w:tc>
+        <w:tc>
+          <w:tcPr>
+            <w:tcW w:w="1330" w:type="pct"/>
+            <w:vAlign w:val="center"/>
+          </w:tcPr>
+          <w:p>
+            <w:r>
+              <w:t>{{</w:t>
+            </w:r>
+            <w:proofErr w:type="spellStart"/>
+            <w:r>
+              <w:t>nombre_coasesor</w:t>
+            </w:r>
+            <w:proofErr w:type="spellEnd"/>
+            <w:r>
+              <w:t>}}</w:t>
+            </w:r>
+          </w:p>
+        </w:tc>
+        <w:tc>
+          <w:tcPr>
+            <w:tcW w:w="1399" w:type="pct"/>
+            <w:vAlign w:val="center"/>
+          </w:tcPr>
+          <w:p>
+            <w:r>
+              <w:t>{{</w:t>
+            </w:r>
+            <w:proofErr w:type="spellStart"/>
+            <w:r>
+              <w:t>correo_coasesor</w:t>
+            </w:r>
+            <w:proofErr w:type="spellEnd"/>
+            <w:r>
+              <w:t>}}</w:t>
+            </w:r>
+          </w:p>
+        </w:tc>
+        <w:tc>
+          <w:tcPr>
+            <w:tcW w:w="887" w:type="pct"/>
+            <w:vAlign w:val="center"/>
+          </w:tcPr>
+          <w:p>
+            <w:r>
+              <w:t>{{</w:t>
+            </w:r>
+            <w:proofErr w:type="spellStart"/>
+            <w:r>
+              <w:t>celular_coasesor</w:t>
+            </w:r>
+            <w:proofErr w:type="spellEnd"/>
+            <w:r>
+              <w:t>}}</w:t>
+            </w:r>
+          </w:p>
         </w:tc>
       </w:tr>
       <w:tr>
@@ -672,7 +702,7 @@
         </w:trPr>
         <w:tc>
           <w:tcPr>
-            <w:tcW w:w="569" w:type="pct"/>
+            <w:tcW w:w="498" w:type="pct"/>
             <w:shd w:val="clear" w:color="auto" w:fill="D0CECE" w:themeFill="background2" w:themeFillShade="E6"/>
             <w:vAlign w:val="center"/>
           </w:tcPr>
@@ -693,7 +723,7 @@
         </w:tc>
         <w:tc>
           <w:tcPr>
-            <w:tcW w:w="641" w:type="pct"/>
+            <w:tcW w:w="887" w:type="pct"/>
             <w:shd w:val="clear" w:color="auto" w:fill="D0CECE" w:themeFill="background2" w:themeFillShade="E6"/>
             <w:vAlign w:val="center"/>
           </w:tcPr>
@@ -711,7 +741,7 @@
         </w:tc>
         <w:tc>
           <w:tcPr>
-            <w:tcW w:w="1539" w:type="pct"/>
+            <w:tcW w:w="1330" w:type="pct"/>
             <w:shd w:val="clear" w:color="auto" w:fill="D0CECE" w:themeFill="background2" w:themeFillShade="E6"/>
             <w:vAlign w:val="center"/>
           </w:tcPr>
@@ -729,7 +759,7 @@
         </w:tc>
         <w:tc>
           <w:tcPr>
-            <w:tcW w:w="1539" w:type="pct"/>
+            <w:tcW w:w="1399" w:type="pct"/>
             <w:shd w:val="clear" w:color="auto" w:fill="D0CECE" w:themeFill="background2" w:themeFillShade="E6"/>
             <w:vAlign w:val="center"/>
           </w:tcPr>
@@ -747,7 +777,7 @@
         </w:tc>
         <w:tc>
           <w:tcPr>
-            <w:tcW w:w="712" w:type="pct"/>
+            <w:tcW w:w="887" w:type="pct"/>
             <w:shd w:val="clear" w:color="auto" w:fill="D0CECE" w:themeFill="background2" w:themeFillShade="E6"/>
             <w:vAlign w:val="center"/>
           </w:tcPr>
@@ -770,7 +800,7 @@
         </w:trPr>
         <w:tc>
           <w:tcPr>
-            <w:tcW w:w="569" w:type="pct"/>
+            <w:tcW w:w="498" w:type="pct"/>
             <w:vAlign w:val="center"/>
           </w:tcPr>
           <w:p>
@@ -781,7 +811,7 @@
         </w:tc>
         <w:tc>
           <w:tcPr>
-            <w:tcW w:w="641" w:type="pct"/>
+            <w:tcW w:w="887" w:type="pct"/>
             <w:vAlign w:val="center"/>
           </w:tcPr>
           <w:p>
@@ -800,7 +830,7 @@
         </w:tc>
         <w:tc>
           <w:tcPr>
-            <w:tcW w:w="1539" w:type="pct"/>
+            <w:tcW w:w="1330" w:type="pct"/>
             <w:vAlign w:val="center"/>
           </w:tcPr>
           <w:p>
@@ -819,7 +849,7 @@
         </w:tc>
         <w:tc>
           <w:tcPr>
-            <w:tcW w:w="1539" w:type="pct"/>
+            <w:tcW w:w="1399" w:type="pct"/>
             <w:vAlign w:val="center"/>
           </w:tcPr>
           <w:p/>
@@ -840,7 +870,7 @@
         </w:tc>
         <w:tc>
           <w:tcPr>
-            <w:tcW w:w="712" w:type="pct"/>
+            <w:tcW w:w="887" w:type="pct"/>
             <w:vAlign w:val="center"/>
           </w:tcPr>
           <w:p>
@@ -858,10 +888,7 @@
           </w:p>
         </w:tc>
       </w:tr>
-      <w:bookmarkEnd w:id="2"/>
-      <w:bookmarkEnd w:id="4"/>
     </w:tbl>
-    <w:p/>
     <w:p>
       <w:pPr>
         <w:rPr>
@@ -894,7 +921,7 @@
             <w:shd w:val="clear" w:color="auto" w:fill="D0CECE" w:themeFill="background2" w:themeFillShade="E6"/>
             <w:vAlign w:val="center"/>
           </w:tcPr>
-          <w:bookmarkEnd w:id="3"/>
+          <w:bookmarkEnd w:id="2"/>
           <w:p>
             <w:pPr>
               <w:jc w:val="center"/>
@@ -1289,7 +1316,7 @@
                 <w:b/>
               </w:rPr>
             </w:pPr>
-            <w:bookmarkStart w:id="5" w:name="_Hlk77858299"/>
+            <w:bookmarkStart w:id="4" w:name="_Hlk77858299"/>
             <w:bookmarkEnd w:id="0"/>
             <w:r>
               <w:rPr>
@@ -1337,7 +1364,7 @@
           </w:p>
         </w:tc>
       </w:tr>
-      <w:bookmarkEnd w:id="5"/>
+      <w:bookmarkEnd w:id="4"/>
     </w:tbl>
     <w:p/>
     <w:tbl>
@@ -1369,7 +1396,8 @@
                 <w:b/>
               </w:rPr>
             </w:pPr>
-            <w:bookmarkStart w:id="6" w:name="_Hlk77857397"/>
+            <w:bookmarkStart w:id="5" w:name="_Hlk77857397"/>
+            <w:bookmarkEnd w:id="1"/>
             <w:r>
               <w:rPr>
                 <w:b/>
@@ -1481,7 +1509,7 @@
             </w:r>
             <w:proofErr w:type="spellStart"/>
             <w:r>
-              <w:t>nombre_docente</w:t>
+              <w:t>nombre_asesor</w:t>
             </w:r>
             <w:proofErr w:type="spellEnd"/>
             <w:r>
@@ -1532,7 +1560,19 @@
             <w:tcW w:w="2000" w:type="pct"/>
             <w:vAlign w:val="center"/>
           </w:tcPr>
-          <w:p/>
+          <w:p>
+            <w:r>
+              <w:t>{{</w:t>
+            </w:r>
+            <w:proofErr w:type="spellStart"/>
+            <w:r>
+              <w:t>nombre_coasesor</w:t>
+            </w:r>
+            <w:proofErr w:type="spellEnd"/>
+            <w:r>
+              <w:t>}}</w:t>
+            </w:r>
+          </w:p>
         </w:tc>
         <w:tc>
           <w:tcPr>
@@ -1575,10 +1615,7 @@
             </w:r>
             <w:proofErr w:type="spellStart"/>
             <w:r>
-              <w:t>nombre_</w:t>
-            </w:r>
-            <w:r>
-              <w:t>estudiante</w:t>
+              <w:t>nombre_estudiante</w:t>
             </w:r>
             <w:proofErr w:type="spellEnd"/>
             <w:r>
@@ -1598,9 +1635,9 @@
           </w:p>
         </w:tc>
       </w:tr>
-      <w:bookmarkEnd w:id="1"/>
-      <w:bookmarkEnd w:id="6"/>
+      <w:bookmarkEnd w:id="5"/>
     </w:tbl>
+    <w:p/>
     <w:p/>
     <w:p/>
     <w:tbl>
@@ -3876,14 +3913,6 @@
 </file>
 
 <file path=customXml/item1.xml><?xml version="1.0" encoding="utf-8"?>
-<s:customData xmlns="http://www.wps.cn/officeDocument/2013/wpsCustomData" xmlns:s="http://www.wps.cn/officeDocument/2013/wpsCustomData">
-  <customSectProps>
-    <customSectPr/>
-  </customSectProps>
-</s:customData>
-</file>
-
-<file path=customXml/item2.xml><?xml version="1.0" encoding="utf-8"?>
 <ct:contentTypeSchema xmlns:ct="http://schemas.microsoft.com/office/2006/metadata/contentType" xmlns:ma="http://schemas.microsoft.com/office/2006/metadata/properties/metaAttributes" ct:_="" ma:_="" ma:contentTypeName="Documento" ma:contentTypeID="0x01010039F241DE3FD6F54A9DC82313360A07F3" ma:contentTypeVersion="14" ma:contentTypeDescription="Crear nuevo documento." ma:contentTypeScope="" ma:versionID="8d51624221f6dd38b7d588fa8f521bc0">
   <xsd:schema xmlns:xsd="http://www.w3.org/2001/XMLSchema" xmlns:xs="http://www.w3.org/2001/XMLSchema" xmlns:p="http://schemas.microsoft.com/office/2006/metadata/properties" xmlns:ns3="28b8b75e-6423-4381-b98c-e8214d0729ad" xmlns:ns4="6f238579-3ff3-4f95-b627-d1b7116fa6e8" targetNamespace="http://schemas.microsoft.com/office/2006/metadata/properties" ma:root="true" ma:fieldsID="240b63e75ddb63de78c4d14b9a1d2a51" ns3:_="" ns4:_="">
     <xsd:import namespace="28b8b75e-6423-4381-b98c-e8214d0729ad"/>
@@ -4112,7 +4141,21 @@
 </ct:contentTypeSchema>
 </file>
 
+<file path=customXml/item2.xml><?xml version="1.0" encoding="utf-8"?>
+<s:customData xmlns="http://www.wps.cn/officeDocument/2013/wpsCustomData" xmlns:s="http://www.wps.cn/officeDocument/2013/wpsCustomData">
+  <customSectProps>
+    <customSectPr/>
+  </customSectProps>
+</s:customData>
+</file>
+
 <file path=customXml/item3.xml><?xml version="1.0" encoding="utf-8"?>
+<p:properties xmlns:p="http://schemas.microsoft.com/office/2006/metadata/properties" xmlns:xsi="http://www.w3.org/2001/XMLSchema-instance" xmlns:pc="http://schemas.microsoft.com/office/infopath/2007/PartnerControls">
+  <documentManagement/>
+</p:properties>
+</file>
+
+<file path=customXml/item4.xml><?xml version="1.0" encoding="utf-8"?>
 <?mso-contentType ?>
 <FormTemplates xmlns="http://schemas.microsoft.com/sharepoint/v3/contenttype/forms">
   <Display>DocumentLibraryForm</Display>
@@ -4121,21 +4164,7 @@
 </FormTemplates>
 </file>
 
-<file path=customXml/item4.xml><?xml version="1.0" encoding="utf-8"?>
-<p:properties xmlns:p="http://schemas.microsoft.com/office/2006/metadata/properties" xmlns:xsi="http://www.w3.org/2001/XMLSchema-instance" xmlns:pc="http://schemas.microsoft.com/office/infopath/2007/PartnerControls">
-  <documentManagement/>
-</p:properties>
-</file>
-
 <file path=customXml/itemProps1.xml><?xml version="1.0" encoding="utf-8"?>
-<ds:datastoreItem xmlns:ds="http://schemas.openxmlformats.org/officeDocument/2006/customXml" ds:itemID="{B1977F7D-205B-4081-913C-38D41E755F92}">
-  <ds:schemaRefs>
-    <ds:schemaRef ds:uri="http://www.wps.cn/officeDocument/2013/wpsCustomData"/>
-  </ds:schemaRefs>
-</ds:datastoreItem>
-</file>
-
-<file path=customXml/itemProps2.xml><?xml version="1.0" encoding="utf-8"?>
 <ds:datastoreItem xmlns:ds="http://schemas.openxmlformats.org/officeDocument/2006/customXml" ds:itemID="{65EF83C7-C9EB-46C4-AD11-B5550519DDD1}">
   <ds:schemaRefs>
     <ds:schemaRef ds:uri="http://schemas.microsoft.com/office/2006/metadata/contentType"/>
@@ -4154,19 +4183,27 @@
 </ds:datastoreItem>
 </file>
 
-<file path=customXml/itemProps3.xml><?xml version="1.0" encoding="utf-8"?>
-<ds:datastoreItem xmlns:ds="http://schemas.openxmlformats.org/officeDocument/2006/customXml" ds:itemID="{29076AFE-B53A-420D-ADB4-84444D77D148}">
+<file path=customXml/itemProps2.xml><?xml version="1.0" encoding="utf-8"?>
+<ds:datastoreItem xmlns:ds="http://schemas.openxmlformats.org/officeDocument/2006/customXml" ds:itemID="{B1977F7D-205B-4081-913C-38D41E755F92}">
   <ds:schemaRefs>
-    <ds:schemaRef ds:uri="http://schemas.microsoft.com/sharepoint/v3/contenttype/forms"/>
+    <ds:schemaRef ds:uri="http://www.wps.cn/officeDocument/2013/wpsCustomData"/>
   </ds:schemaRefs>
 </ds:datastoreItem>
 </file>
 
-<file path=customXml/itemProps4.xml><?xml version="1.0" encoding="utf-8"?>
+<file path=customXml/itemProps3.xml><?xml version="1.0" encoding="utf-8"?>
 <ds:datastoreItem xmlns:ds="http://schemas.openxmlformats.org/officeDocument/2006/customXml" ds:itemID="{E357295D-7933-4AE2-B0FE-A1E3A33741E0}">
   <ds:schemaRefs>
     <ds:schemaRef ds:uri="http://schemas.microsoft.com/office/2006/metadata/properties"/>
     <ds:schemaRef ds:uri="http://schemas.microsoft.com/office/infopath/2007/PartnerControls"/>
   </ds:schemaRefs>
 </ds:datastoreItem>
+</file>
+
+<file path=customXml/itemProps4.xml><?xml version="1.0" encoding="utf-8"?>
+<ds:datastoreItem xmlns:ds="http://schemas.openxmlformats.org/officeDocument/2006/customXml" ds:itemID="{29076AFE-B53A-420D-ADB4-84444D77D148}">
+  <ds:schemaRefs>
+    <ds:schemaRef ds:uri="http://schemas.microsoft.com/sharepoint/v3/contenttype/forms"/>
+  </ds:schemaRefs>
+</ds:datastoreItem>
 </file>
</xml_diff>